<commit_message>
docs: align 8 figures for Homework 3 documentation report
</commit_message>
<xml_diff>
--- a/TONN-Sievphor-Documentation_homework3.docx
+++ b/TONN-Sievphor-Documentation_homework3.docx
@@ -8,14 +8,32 @@
       </w:pPr>
       <w:r>
         <w:rPr>
-          <w:rFonts w:ascii="Khmer OS Battambang" w:hAnsi="Khmer OS Battambang"/>
+          <w:rFonts w:ascii="Khmer OS Muol Light" w:hAnsi="Khmer OS Muol Light"/>
           <w:b/>
           <w:color w:val="102C57"/>
-          <w:sz w:val="28"/>
+          <w:sz w:val="26"/>
         </w:rPr>
         <w:t>សាកលវិទ្យាល័យ សៅស៍អុីសថ៍អេយេសៀ</w:t>
         <w:br/>
+      </w:r>
+      <w:r>
+        <w:rPr>
+          <w:rFonts w:ascii="Arial" w:hAnsi="Arial"/>
+          <w:b/>
+          <w:color w:val="102C57"/>
+          <w:sz w:val="24"/>
+        </w:rPr>
         <w:t>UNIVERSITY OF SOUTH-EAST ASIA</w:t>
+        <w:br/>
+      </w:r>
+      <w:r>
+        <w:rPr>
+          <w:rFonts w:ascii="Arial" w:hAnsi="Arial"/>
+          <w:color w:val="475569"/>
+          <w:sz w:val="22"/>
+        </w:rPr>
+        <w:t>Faculty of Science and Technology</w:t>
+        <w:br/>
         <w:br/>
       </w:r>
     </w:p>
@@ -25,13 +43,21 @@
       </w:pPr>
       <w:r>
         <w:rPr>
-          <w:rFonts w:ascii="Calibri" w:hAnsi="Calibri"/>
+          <w:rFonts w:ascii="Arial" w:hAnsi="Arial"/>
           <w:b/>
           <w:color w:val="2563EB"/>
-          <w:sz w:val="32"/>
+          <w:sz w:val="36"/>
         </w:rPr>
         <w:t>Homework 3</w:t>
         <w:br/>
+      </w:r>
+      <w:r>
+        <w:rPr>
+          <w:rFonts w:ascii="Arial" w:hAnsi="Arial"/>
+          <w:b/>
+          <w:color w:val="1E293B"/>
+          <w:sz w:val="26"/>
+        </w:rPr>
         <w:t>RELEASE MANAGEMENT: GITHUB TAGS &amp; JENKINS BUILD/PUSH/DEPLOY/ROLLBACK</w:t>
         <w:br/>
       </w:r>
@@ -43,8 +69,8 @@
         <w:tblLook w:firstColumn="1" w:firstRow="1" w:lastColumn="0" w:lastRow="0" w:noHBand="0" w:noVBand="1" w:val="04A0"/>
       </w:tblPr>
       <w:tblGrid>
-        <w:gridCol w:w="4680"/>
-        <w:gridCol w:w="4680"/>
+        <w:gridCol w:w="4968"/>
+        <w:gridCol w:w="4968"/>
       </w:tblGrid>
       <w:tr>
         <w:tc>
@@ -55,8 +81,9 @@
           <w:p>
             <w:r>
               <w:rPr>
-                <w:rFonts w:ascii="Calibri" w:hAnsi="Calibri"/>
+                <w:rFonts w:ascii="Arial" w:hAnsi="Arial"/>
                 <w:b/>
+                <w:sz w:val="20"/>
               </w:rPr>
               <w:t>Course:</w:t>
             </w:r>
@@ -64,13 +91,14 @@
         </w:tc>
         <w:tc>
           <w:tcPr>
-            <w:tcW w:type="dxa" w:w="6048"/>
+            <w:tcW w:type="dxa" w:w="6480"/>
             <w:shd w:val="clear" w:color="auto" w:fill="F8FAFC"/>
           </w:tcPr>
           <w:p>
             <w:r>
               <w:rPr>
-                <w:rFonts w:ascii="Calibri" w:hAnsi="Calibri"/>
+                <w:rFonts w:ascii="Arial" w:hAnsi="Arial"/>
+                <w:sz w:val="20"/>
               </w:rPr>
               <w:t>Advanced Cloud Technology</w:t>
             </w:r>
@@ -86,8 +114,9 @@
           <w:p>
             <w:r>
               <w:rPr>
-                <w:rFonts w:ascii="Calibri" w:hAnsi="Calibri"/>
+                <w:rFonts w:ascii="Arial" w:hAnsi="Arial"/>
                 <w:b/>
+                <w:sz w:val="20"/>
               </w:rPr>
               <w:t>Lecturer:</w:t>
             </w:r>
@@ -95,13 +124,14 @@
         </w:tc>
         <w:tc>
           <w:tcPr>
-            <w:tcW w:type="dxa" w:w="6048"/>
+            <w:tcW w:type="dxa" w:w="6480"/>
             <w:shd w:val="clear" w:color="auto" w:fill="F8FAFC"/>
           </w:tcPr>
           <w:p>
             <w:r>
               <w:rPr>
-                <w:rFonts w:ascii="Calibri" w:hAnsi="Calibri"/>
+                <w:rFonts w:ascii="Arial" w:hAnsi="Arial"/>
+                <w:sz w:val="20"/>
               </w:rPr>
               <w:t>Mr. Krol Noeurn</w:t>
             </w:r>
@@ -117,8 +147,9 @@
           <w:p>
             <w:r>
               <w:rPr>
-                <w:rFonts w:ascii="Calibri" w:hAnsi="Calibri"/>
+                <w:rFonts w:ascii="Arial" w:hAnsi="Arial"/>
                 <w:b/>
+                <w:sz w:val="20"/>
               </w:rPr>
               <w:t>Student Name:</w:t>
             </w:r>
@@ -126,13 +157,14 @@
         </w:tc>
         <w:tc>
           <w:tcPr>
-            <w:tcW w:type="dxa" w:w="6048"/>
+            <w:tcW w:type="dxa" w:w="6480"/>
             <w:shd w:val="clear" w:color="auto" w:fill="F8FAFC"/>
           </w:tcPr>
           <w:p>
             <w:r>
               <w:rPr>
-                <w:rFonts w:ascii="Calibri" w:hAnsi="Calibri"/>
+                <w:rFonts w:ascii="Arial" w:hAnsi="Arial"/>
+                <w:sz w:val="20"/>
               </w:rPr>
               <w:t>TONN Sievphor</w:t>
             </w:r>
@@ -148,8 +180,9 @@
           <w:p>
             <w:r>
               <w:rPr>
-                <w:rFonts w:ascii="Calibri" w:hAnsi="Calibri"/>
+                <w:rFonts w:ascii="Arial" w:hAnsi="Arial"/>
                 <w:b/>
+                <w:sz w:val="20"/>
               </w:rPr>
               <w:t>GitHub Repository:</w:t>
             </w:r>
@@ -157,13 +190,14 @@
         </w:tc>
         <w:tc>
           <w:tcPr>
-            <w:tcW w:type="dxa" w:w="6048"/>
+            <w:tcW w:type="dxa" w:w="6480"/>
             <w:shd w:val="clear" w:color="auto" w:fill="F8FAFC"/>
           </w:tcPr>
           <w:p>
             <w:r>
               <w:rPr>
-                <w:rFonts w:ascii="Calibri" w:hAnsi="Calibri"/>
+                <w:rFonts w:ascii="Arial" w:hAnsi="Arial"/>
+                <w:sz w:val="20"/>
               </w:rPr>
               <w:t>https://github.com/Sievphor/cloud_home_work_3.git</w:t>
             </w:r>
@@ -179,8 +213,9 @@
           <w:p>
             <w:r>
               <w:rPr>
-                <w:rFonts w:ascii="Calibri" w:hAnsi="Calibri"/>
+                <w:rFonts w:ascii="Arial" w:hAnsi="Arial"/>
                 <w:b/>
+                <w:sz w:val="20"/>
               </w:rPr>
               <w:t>Amazon ECR URI:</w:t>
             </w:r>
@@ -188,13 +223,14 @@
         </w:tc>
         <w:tc>
           <w:tcPr>
-            <w:tcW w:type="dxa" w:w="6048"/>
+            <w:tcW w:type="dxa" w:w="6480"/>
             <w:shd w:val="clear" w:color="auto" w:fill="F8FAFC"/>
           </w:tcPr>
           <w:p>
             <w:r>
               <w:rPr>
-                <w:rFonts w:ascii="Calibri" w:hAnsi="Calibri"/>
+                <w:rFonts w:ascii="Arial" w:hAnsi="Arial"/>
+                <w:sz w:val="20"/>
               </w:rPr>
               <w:t>908157891706.dkr.ecr.us-east-1.amazonaws.com/sievphor-homework3</w:t>
             </w:r>
@@ -210,8 +246,9 @@
           <w:p>
             <w:r>
               <w:rPr>
-                <w:rFonts w:ascii="Calibri" w:hAnsi="Calibri"/>
+                <w:rFonts w:ascii="Arial" w:hAnsi="Arial"/>
                 <w:b/>
+                <w:sz w:val="20"/>
               </w:rPr>
               <w:t>Academic Year:</w:t>
             </w:r>
@@ -219,13 +256,14 @@
         </w:tc>
         <w:tc>
           <w:tcPr>
-            <w:tcW w:type="dxa" w:w="6048"/>
+            <w:tcW w:type="dxa" w:w="6480"/>
             <w:shd w:val="clear" w:color="auto" w:fill="F8FAFC"/>
           </w:tcPr>
           <w:p>
             <w:r>
               <w:rPr>
-                <w:rFonts w:ascii="Calibri" w:hAnsi="Calibri"/>
+                <w:rFonts w:ascii="Arial" w:hAnsi="Arial"/>
+                <w:sz w:val="20"/>
               </w:rPr>
               <w:t>2026 - 2027</w:t>
             </w:r>
@@ -244,7 +282,7 @@
           <w:rFonts w:ascii="Khmer OS Battambang" w:hAnsi="Khmer OS Battambang"/>
           <w:b/>
           <w:color w:val="1E3A8A"/>
-          <w:sz w:val="26"/>
+          <w:sz w:val="24"/>
         </w:rPr>
         <w:t>១. សេចក្តីផ្តើម (Introduction)</w:t>
       </w:r>
@@ -256,9 +294,9 @@
       <w:r>
         <w:rPr>
           <w:rFonts w:ascii="Khmer OS Battambang" w:hAnsi="Khmer OS Battambang"/>
-          <w:sz w:val="21"/>
+          <w:sz w:val="20"/>
         </w:rPr>
-        <w:t>កិច្ចការ Homework 3 ផ្តោតសំខាន់លើការគ្រប់គ្រងការបញ្ចេញកូដ (Release Management) ដោយប្រើប្រាស់ GitHub Tags និង Semantic Versioning (vMAJOR.MINOR.PATCH) នៅក្នុង Repository https://github.com/Sievphor/cloud_home_work_3.git។ ជំនួសឱ្យការ Deploy រាល់ពេលមាន Commit តូចតាច ប្រព័ន្ធ CI/CD របស់ Jenkins ដំណើរការតែនៅពេលមានការ Push Git Tag ប៉ុណ្ណោះ។ Docker Image ទាំងអស់ត្រូវបានដាក់ Tag ដូចគ្នានឹង Git Tag ហើយត្រូវបានរក្សាទុកជា Immutable Tags នៅក្នុង Amazon ECR (908157891706.dkr.ecr.us-east-1.amazonaws.com/sievphor-homework3)។ លើសពីនេះ ប្រព័ន្ធត្រូវបានបំពាក់នូវយន្តការ Rollback ដែលអនុញ្ញាតឱ្យត្រឡប់ទៅកាន់កំណែមុនបានភ្លាមៗ ដោយមិនបាច់ Build Image ឡើងវិញឡើយ។</w:t>
+        <w:t>កិច្ចការ Homework 3 ផ្តោតលើការគ្រប់គ្រងការបញ្ចេញកូដ (Release Management) ដោយប្រើប្រាស់ GitHub Tags ជាមួយ Semantic Versioning (vMAJOR.MINOR.PATCH)។ ជំនួសឱ្យការ Deploy រាល់ពេលមាន Commit តូចតាច ប្រព័ន្ធ CI/CD របស់ Jenkins ដំណើរការតែនៅពេលមានការ Push Git Tag (v1.0.0, v1.1.0, v1.2.0) ប៉ុណ្ណោះ។ Docker Image ទាំងអស់ត្រូវបានដាក់ Tag ដូចគ្នានឹង Git Tag និងរក្សាទុកជា Immutable Tags ក្នុង Amazon ECR។ លើសពីនេះ ប្រព័ន្ធត្រូវបានបំពាក់នូវយន្តការ Rollback ដែលអនុញ្ញាតឱ្យត្រឡប់ទៅកាន់កំណែចាស់ពីមុនបានភ្លាមៗ ដោយមិនបាច់ Build Image ឡើងវិញឡើយ (No Rebuild)។</w:t>
       </w:r>
     </w:p>
     <w:p>
@@ -267,9 +305,9 @@
           <w:rFonts w:ascii="Khmer OS Battambang" w:hAnsi="Khmer OS Battambang"/>
           <w:b/>
           <w:color w:val="1E3A8A"/>
-          <w:sz w:val="26"/>
+          <w:sz w:val="24"/>
         </w:rPr>
-        <w:t>២. គោលបំណង (Objectives)</w:t>
+        <w:t>២. គោលបំណង និងរចនាសម្ព័ន្ធគម្រោង (Objectives &amp; Repository)</w:t>
       </w:r>
     </w:p>
     <w:p>
@@ -279,7 +317,7 @@
       <w:r>
         <w:rPr>
           <w:rFonts w:ascii="Khmer OS Battambang" w:hAnsi="Khmer OS Battambang"/>
-          <w:sz w:val="21"/>
+          <w:sz w:val="20"/>
         </w:rPr>
         <w:t>• អនុវត្ត Semantic Versioning (v1.0.0, v1.1.0, v1.2.0) ក្នុងការគ្រប់គ្រង Release</w:t>
         <w:br/>
@@ -287,9 +325,26 @@
         <w:br/>
         <w:t>• ធានាថា Docker Image Tag ត្រូវគ្នានឹង Git Tag និងរក្សាទុកគ្រប់រូបភាពទាំងអស់ក្នុង ECR</w:t>
         <w:br/>
-        <w:t>• Parameterize Pipeline ជាមួយ ACTION (build, push, deploy, rollback) និង VERSION</w:t>
+        <w:t>• Parameterize Pipeline ជាមួយ ACTION (all, build, push, deploy, rollback) និង VERSION</w:t>
         <w:br/>
         <w:t>• អនុវត្ត Rollback ដោយទាញយក Image ចាស់ពី ECR មក Deploy លើ Docker Swarm ដោយគ្មាន Rebuild។</w:t>
+        <w:br/>
+        <w:t>គម្រោងត្រូវបានរៀបចំឡើងយ៉ាងស្អាតនៅលើ GitHub: https://github.com/Sievphor/cloud_home_work_3 រួមមានឯកសារ RELEASING.md, Jenkinsfile, docker-stack.yml និងកូដគម្រោង។</w:t>
+      </w:r>
+    </w:p>
+    <w:p>
+      <w:pPr>
+        <w:spacing w:before="120" w:after="240"/>
+        <w:jc w:val="center"/>
+      </w:pPr>
+      <w:r>
+        <w:rPr>
+          <w:rFonts w:ascii="Khmer OS Battambang" w:hAnsi="Khmer OS Battambang"/>
+          <w:i/>
+          <w:color w:val="64748B"/>
+          <w:sz w:val="19"/>
+        </w:rPr>
+        <w:t>[រូបភាពទី ១៖ GitHub Repository &amp; RELEASING.md (cloud_home_work_3) - សូម Paste រូបភាព Screenshot នៅទីនេះ]</w:t>
       </w:r>
     </w:p>
     <w:p>
@@ -298,9 +353,9 @@
           <w:rFonts w:ascii="Khmer OS Battambang" w:hAnsi="Khmer OS Battambang"/>
           <w:b/>
           <w:color w:val="1E3A8A"/>
-          <w:sz w:val="26"/>
+          <w:sz w:val="24"/>
         </w:rPr>
-        <w:t>៣. បច្ចេកវិទ្យា និងបរិស្ថាន (Technology &amp; Environment)</w:t>
+        <w:t>៣. ដំណើរការអនុវត្តជាក់ស្តែង (Implementation Steps)</w:t>
       </w:r>
     </w:p>
     <w:p>
@@ -310,26 +365,26 @@
       <w:r>
         <w:rPr>
           <w:rFonts w:ascii="Khmer OS Battambang" w:hAnsi="Khmer OS Battambang"/>
-          <w:sz w:val="21"/>
+          <w:sz w:val="20"/>
         </w:rPr>
-        <w:t>• GitHub &amp; Git Tags: រក្សាទុក Source Code (cloud_home_work_3) និងកំណត់កំណែ Release</w:t>
+        <w:t>៣.១ ការបង្កើត Git Tags តាម Semantic Versioning:</w:t>
         <w:br/>
-        <w:t>• Jenkins: ស្វ័យប្រវត្តិកម្ម CI/CD Pipeline ជាមួយ Parameters</w:t>
-        <w:br/>
-        <w:t>• Docker &amp; Amazon ECR: Build និងរក្សាទុក Versioned Container Images</w:t>
-        <w:br/>
-        <w:t>• Amazon EC2 &amp; Docker Swarm: ដំណើរការសេវាកម្មជាមួយ Replicas ទាំង ៣ និង Rolling Update (Manager: 13.220.98.249, Worker 1: 34.229.219.41, Worker 2: 54.90.208.206)</w:t>
+        <w:t>បានបង្កើត Releases ចំនួន ៣ រួមមាន v1.0.0, v1.1.0, និង v1.2.0 នៅក្នុង GitHub Repository https://github.com/Sievphor/cloud_home_work_3.git ដោយប្រើពាក្យបញ្ជា 'git tag -a &lt;tag&gt; -m &lt;msg&gt;' និងរុញទៅ GitHub តាមរយៈ 'git push origin --tags'។</w:t>
       </w:r>
     </w:p>
     <w:p>
+      <w:pPr>
+        <w:spacing w:before="120" w:after="240"/>
+        <w:jc w:val="center"/>
+      </w:pPr>
       <w:r>
         <w:rPr>
           <w:rFonts w:ascii="Khmer OS Battambang" w:hAnsi="Khmer OS Battambang"/>
-          <w:b/>
-          <w:color w:val="1E3A8A"/>
-          <w:sz w:val="26"/>
+          <w:i/>
+          <w:color w:val="64748B"/>
+          <w:sz w:val="19"/>
         </w:rPr>
-        <w:t>៤. ដំណើរការអនុវត្តជាក់ស្តែង (Implementation Steps)</w:t>
+        <w:t>[រូបភាពទី ២៖ GitHub Releases &amp; Tags (v1.0.0, v1.1.0, v1.2.0) - សូម Paste រូបភាព Screenshot នៅទីនេះ]</w:t>
       </w:r>
     </w:p>
     <w:p>
@@ -339,11 +394,26 @@
       <w:r>
         <w:rPr>
           <w:rFonts w:ascii="Khmer OS Battambang" w:hAnsi="Khmer OS Battambang"/>
-          <w:sz w:val="21"/>
+          <w:sz w:val="20"/>
         </w:rPr>
-        <w:t>៤.១ ការបង្កើត Git Tags តាម Semantic Versioning:</w:t>
+        <w:t>៣.២ ការកំណត់ Jenkins Parameterized Pipeline:</w:t>
         <w:br/>
-        <w:t>បានបង្កើត Releases ចំនួន ៣ រួមមាន v1.0.0, v1.1.0, និង v1.2.0 ដោយប្រើពាក្យបញ្ជា 'git tag -a &lt;version&gt; -m &lt;msg&gt;' និង Push ទៅកាន់ GitHub តាមរយៈ 'git push origin &lt;version&gt;'។</w:t>
+        <w:t>Jenkinsfile ត្រូវបានរៀបចំឱ្យទទួល Parameters ACTION (all, build, push, deploy, rollback) និង VERSION។ នៅពេលមាន Tag Push មកដល់ Jenkins នឹងដំណើរការ Build និង Deploy ដោយស្វ័យប្រវត្តិ។</w:t>
+      </w:r>
+    </w:p>
+    <w:p>
+      <w:pPr>
+        <w:spacing w:before="120" w:after="240"/>
+        <w:jc w:val="center"/>
+      </w:pPr>
+      <w:r>
+        <w:rPr>
+          <w:rFonts w:ascii="Khmer OS Battambang" w:hAnsi="Khmer OS Battambang"/>
+          <w:i/>
+          <w:color w:val="64748B"/>
+          <w:sz w:val="19"/>
+        </w:rPr>
+        <w:t>[រូបភាពទី ៣៖ Jenkins Parameterized Build (ACTION &amp; VERSION) - សូម Paste រូបភាព Screenshot នៅទីនេះ]</w:t>
       </w:r>
     </w:p>
     <w:p>
@@ -353,11 +423,26 @@
       <w:r>
         <w:rPr>
           <w:rFonts w:ascii="Khmer OS Battambang" w:hAnsi="Khmer OS Battambang"/>
-          <w:sz w:val="21"/>
+          <w:sz w:val="20"/>
         </w:rPr>
-        <w:t>៤.២ ការកំណត់ Jenkins Parameterized Pipeline:</w:t>
+        <w:t>៣.៣ ការរក្សាទុក Image ជា Immutable Tags ក្នុង Amazon ECR:</w:t>
         <w:br/>
-        <w:t>Jenkinsfile ត្រូវបានរៀបចំឱ្យទទួល Parameters ACTION (build, push, deploy, rollback) និង VERSION សម្រាប់បញ្ជាក់ពីលេខ Tag។ នៅពេលមាន Tag Push មកដល់ Jenkins នឹង Build និង Deploy ដោយស្វ័យប្រវត្តិ។</w:t>
+        <w:t>រូបភាពនីមួយៗត្រូវបាន Push ទៅកាន់ ECR Repository 'sievphor-homework3' (URI: 908157891706.dkr.ecr.us-east-1.amazonaws.com/sievphor-homework3)។ រូបភាព v1.0.0, v1.1.0, និង v1.2.0 ត្រូវបានរក្សាទុកទាំងអស់ជា Immutable Tags ដោយមិនមានការសរសេរជាន់លើឡើយ។</w:t>
+      </w:r>
+    </w:p>
+    <w:p>
+      <w:pPr>
+        <w:spacing w:before="120" w:after="240"/>
+        <w:jc w:val="center"/>
+      </w:pPr>
+      <w:r>
+        <w:rPr>
+          <w:rFonts w:ascii="Khmer OS Battambang" w:hAnsi="Khmer OS Battambang"/>
+          <w:i/>
+          <w:color w:val="64748B"/>
+          <w:sz w:val="19"/>
+        </w:rPr>
+        <w:t>[រូបភាពទី ៤៖ Amazon ECR Immutable Tags (v1.0.0, v1.1.0, v1.2.0) - សូម Paste រូបភាព Screenshot នៅទីនេះ]</w:t>
       </w:r>
     </w:p>
     <w:p>
@@ -367,11 +452,37 @@
       <w:r>
         <w:rPr>
           <w:rFonts w:ascii="Khmer OS Battambang" w:hAnsi="Khmer OS Battambang"/>
-          <w:sz w:val="21"/>
+          <w:sz w:val="20"/>
         </w:rPr>
-        <w:t>៤.៣ ការរក្សាទុក Image ក្នុង Amazon ECR:</w:t>
+        <w:t>៣.៤ ការ Deploy លើ Docker Swarm និងការបង្ហាញវេបសាយ:</w:t>
         <w:br/>
-        <w:t>រាល់ការ Build រូបភាពត្រូវបានដាក់ Tag ដូចគ្នានឹង Git Tag ហើយ Push ទៅ ECR Repository '908157891706.dkr.ecr.us-east-1.amazonaws.com/sievphor-homework3'។ គ្រប់ Tags ទាំងអស់ត្រូវបានរក្សាទុកដោយគ្មានការសរសេរជាន់លើ។</w:t>
+        <w:t>Jenkins ធ្វើបច្ចុប្បន្នភាពលើ Service homework3_web លើ Port 80 តាមរយៈ Rolling Update ធានាថាកម្មវិធីនៅតែដំណើរការធម្មតាគ្រប់ពេលវេលាលើ Cluster Nodes ទាំង ៣ (Manager, Worker 1, Worker 2)។</w:t>
+      </w:r>
+    </w:p>
+    <w:p>
+      <w:pPr>
+        <w:spacing w:before="120" w:after="240"/>
+        <w:jc w:val="center"/>
+      </w:pPr>
+      <w:r>
+        <w:rPr>
+          <w:rFonts w:ascii="Khmer OS Battambang" w:hAnsi="Khmer OS Battambang"/>
+          <w:i/>
+          <w:color w:val="64748B"/>
+          <w:sz w:val="19"/>
+        </w:rPr>
+        <w:t>[រូបភាពទី ៥៖ វេបសាយ Version v1.0.0 (Port 80) បង្ហាញ Badge Version - សូម Paste រូបភាព Screenshot នៅទីនេះ]</w:t>
+      </w:r>
+    </w:p>
+    <w:p>
+      <w:r>
+        <w:rPr>
+          <w:rFonts w:ascii="Khmer OS Battambang" w:hAnsi="Khmer OS Battambang"/>
+          <w:b/>
+          <w:color w:val="1E3A8A"/>
+          <w:sz w:val="24"/>
+        </w:rPr>
+        <w:t>៤. ការអនុវត្ត Rollback ដោយមិនបាច់ Rebuild (Zero Rebuild Rollback)</w:t>
       </w:r>
     </w:p>
     <w:p>
@@ -381,11 +492,62 @@
       <w:r>
         <w:rPr>
           <w:rFonts w:ascii="Khmer OS Battambang" w:hAnsi="Khmer OS Battambang"/>
-          <w:sz w:val="21"/>
+          <w:sz w:val="20"/>
         </w:rPr>
-        <w:t>៤.៤ ការ Deploy លើ Docker Swarm:</w:t>
+        <w:t>នៅពេលរកឃើញបញ្ហាក្នុងកំណែ v1.2.0 យើងបានធ្វើការ Rollback ត្រឡប់ទៅកំណែចាស់ v1.0.0៖</w:t>
         <w:br/>
-        <w:t>Jenkins ធ្វើបច្ចុប្បន្នភាពលើ Service 'homework3_web' តាមរយៈ Rolling Update (parallelism: 1, delay: 10s) ធានាថាកម្មវិធីនៅតែអាចចូលប្រើប្រាស់បានជានិច្ចអំឡុងពេល Deploy លើ Port 80។</w:t>
+        <w:t>១. ចូលទៅកាន់ Jenkins Job ហើយជ្រើសរើស ACTION = rollback និង VERSION = v1.0.0</w:t>
+        <w:br/>
+        <w:t>២. Pipeline បានផ្ទៀងផ្ទាត់វត្តមានរបស់ Image v1.0.0 នៅក្នុង Amazon ECR ជាមុនតាមរយៈ aws ecr describe-images</w:t>
+        <w:br/>
+        <w:t>៣. Jenkins បានបញ្ជាទៅ Swarm Manager (13.220.98.249) ឱ្យធ្វើ Rolling Update ទៅកាន់ Image v1.0.0 ដោយផ្ទាល់</w:t>
+        <w:br/>
+        <w:t>៤. ដំណើរការនេះពុំមានការ Checkout កូដ ឬ Build រូបភាពថ្មីឡើយ (No Rebuild) ដែលជួយកាត់បន្ថយពេលវេលា និងគ្មានហានិភ័យនៃកំហុសកូដ។</w:t>
+      </w:r>
+    </w:p>
+    <w:p>
+      <w:pPr>
+        <w:spacing w:before="120" w:after="240"/>
+        <w:jc w:val="center"/>
+      </w:pPr>
+      <w:r>
+        <w:rPr>
+          <w:rFonts w:ascii="Khmer OS Battambang" w:hAnsi="Khmer OS Battambang"/>
+          <w:i/>
+          <w:color w:val="64748B"/>
+          <w:sz w:val="19"/>
+        </w:rPr>
+        <w:t>[រូបភាពទី ៦៖ ការអនុវត្ត Rollback ក្នុង Jenkins (No Rebuild Console Log) - សូម Paste រូបភាព Screenshot នៅទីនេះ]</w:t>
+      </w:r>
+    </w:p>
+    <w:p>
+      <w:pPr>
+        <w:spacing w:before="120" w:after="240"/>
+        <w:jc w:val="center"/>
+      </w:pPr>
+      <w:r>
+        <w:rPr>
+          <w:rFonts w:ascii="Khmer OS Battambang" w:hAnsi="Khmer OS Battambang"/>
+          <w:i/>
+          <w:color w:val="64748B"/>
+          <w:sz w:val="19"/>
+        </w:rPr>
+        <w:t>[រូបភាពទី ៧៖ ស្ថានភាព Swarm Service ក្រោយ Rollback (docker service inspect) - សូម Paste រូបភាព Screenshot នៅទីនេះ]</w:t>
+      </w:r>
+    </w:p>
+    <w:p>
+      <w:pPr>
+        <w:spacing w:before="120" w:after="240"/>
+        <w:jc w:val="center"/>
+      </w:pPr>
+      <w:r>
+        <w:rPr>
+          <w:rFonts w:ascii="Khmer OS Battambang" w:hAnsi="Khmer OS Battambang"/>
+          <w:i/>
+          <w:color w:val="64748B"/>
+          <w:sz w:val="19"/>
+        </w:rPr>
+        <w:t>[រូបភាពទី ៨៖ វេបសាយក្រោយ Rollback ជោគជ័យ (Port 80 ដំណើរការធម្មតា) - សូម Paste រូបភាព Screenshot នៅទីនេះ]</w:t>
       </w:r>
     </w:p>
     <w:p>
@@ -394,40 +556,9 @@
           <w:rFonts w:ascii="Khmer OS Battambang" w:hAnsi="Khmer OS Battambang"/>
           <w:b/>
           <w:color w:val="1E3A8A"/>
-          <w:sz w:val="26"/>
+          <w:sz w:val="24"/>
         </w:rPr>
-        <w:t>៥. ការអនុវត្ត Rollback ដោយមិនបាច់ Rebuild</w:t>
-      </w:r>
-    </w:p>
-    <w:p>
-      <w:pPr>
-        <w:spacing w:line="276" w:lineRule="auto"/>
-      </w:pPr>
-      <w:r>
-        <w:rPr>
-          <w:rFonts w:ascii="Khmer OS Battambang" w:hAnsi="Khmer OS Battambang"/>
-          <w:sz w:val="21"/>
-        </w:rPr>
-        <w:t>នៅពេលមានបញ្ហាកើតឡើងលើកំណែ v1.2.0 យើងបានធ្វើការ Rollback ត្រឡប់ទៅកំណែ v1.0.0៖</w:t>
-        <w:br/>
-        <w:t>១. ដំណើរការ Jenkins Job ដោយជ្រើសរើស ACTION = rollback និង VERSION = v1.0.0</w:t>
-        <w:br/>
-        <w:t>២. Pipeline បានផ្ទៀងផ្ទាត់វត្តមានរបស់ Image v1.0.0 នៅក្នុង Amazon ECR ជាមុន</w:t>
-        <w:br/>
-        <w:t>៣. Jenkins បានបញ្ជាទៅ Swarm Manager (13.220.98.249) ឱ្យធ្វើ Rolling Update ទៅកាន់ Image v1.0.0 ផ្ទាល់</w:t>
-        <w:br/>
-        <w:t>៤. ដំណើរការនេះពុំមានការទាញយកកូដ ឬ Build រូបភាពថ្មីឡើយ (No Rebuild) ដែលជួយសន្សំពេលវេលា និងគ្មានហានិភ័យនៃកំហុសកូដ។</w:t>
-      </w:r>
-    </w:p>
-    <w:p>
-      <w:r>
-        <w:rPr>
-          <w:rFonts w:ascii="Khmer OS Battambang" w:hAnsi="Khmer OS Battambang"/>
-          <w:b/>
-          <w:color w:val="1E3A8A"/>
-          <w:sz w:val="26"/>
-        </w:rPr>
-        <w:t>៦. កំណត់ត្រាប្រវត្តិនៃការបញ្ចេញកូដ និង Rollback</w:t>
+        <w:t>៥. កំណត់ត្រាប្រវត្តិនៃការបញ្ចេញកូដ និង Rollback (Deployment History)</w:t>
       </w:r>
     </w:p>
     <w:tbl>
@@ -437,22 +568,23 @@
         <w:tblLook w:firstColumn="1" w:firstRow="1" w:lastColumn="0" w:lastRow="0" w:noHBand="0" w:noVBand="1" w:val="04A0"/>
       </w:tblPr>
       <w:tblGrid>
-        <w:gridCol w:w="2340"/>
-        <w:gridCol w:w="2340"/>
-        <w:gridCol w:w="2340"/>
-        <w:gridCol w:w="2340"/>
+        <w:gridCol w:w="2484"/>
+        <w:gridCol w:w="2484"/>
+        <w:gridCol w:w="2484"/>
+        <w:gridCol w:w="2484"/>
       </w:tblGrid>
       <w:tr>
         <w:tc>
           <w:tcPr>
-            <w:tcW w:type="dxa" w:w="2340"/>
+            <w:tcW w:type="dxa" w:w="2484"/>
             <w:shd w:val="clear" w:color="auto" w:fill="E2E8F0"/>
           </w:tcPr>
           <w:p>
             <w:r>
               <w:rPr>
-                <w:rFonts w:ascii="Calibri" w:hAnsi="Calibri"/>
+                <w:rFonts w:ascii="Arial" w:hAnsi="Arial"/>
                 <w:b/>
+                <w:sz w:val="19"/>
               </w:rPr>
               <w:t>Version</w:t>
             </w:r>
@@ -460,14 +592,15 @@
         </w:tc>
         <w:tc>
           <w:tcPr>
-            <w:tcW w:type="dxa" w:w="2340"/>
+            <w:tcW w:type="dxa" w:w="2484"/>
             <w:shd w:val="clear" w:color="auto" w:fill="E2E8F0"/>
           </w:tcPr>
           <w:p>
             <w:r>
               <w:rPr>
-                <w:rFonts w:ascii="Calibri" w:hAnsi="Calibri"/>
+                <w:rFonts w:ascii="Arial" w:hAnsi="Arial"/>
                 <w:b/>
+                <w:sz w:val="19"/>
               </w:rPr>
               <w:t>Action</w:t>
             </w:r>
@@ -475,14 +608,15 @@
         </w:tc>
         <w:tc>
           <w:tcPr>
-            <w:tcW w:type="dxa" w:w="2340"/>
+            <w:tcW w:type="dxa" w:w="2484"/>
             <w:shd w:val="clear" w:color="auto" w:fill="E2E8F0"/>
           </w:tcPr>
           <w:p>
             <w:r>
               <w:rPr>
-                <w:rFonts w:ascii="Calibri" w:hAnsi="Calibri"/>
+                <w:rFonts w:ascii="Arial" w:hAnsi="Arial"/>
                 <w:b/>
+                <w:sz w:val="19"/>
               </w:rPr>
               <w:t>Image Source</w:t>
             </w:r>
@@ -490,14 +624,15 @@
         </w:tc>
         <w:tc>
           <w:tcPr>
-            <w:tcW w:type="dxa" w:w="2340"/>
+            <w:tcW w:type="dxa" w:w="2484"/>
             <w:shd w:val="clear" w:color="auto" w:fill="E2E8F0"/>
           </w:tcPr>
           <w:p>
             <w:r>
               <w:rPr>
-                <w:rFonts w:ascii="Calibri" w:hAnsi="Calibri"/>
+                <w:rFonts w:ascii="Arial" w:hAnsi="Arial"/>
                 <w:b/>
+                <w:sz w:val="19"/>
               </w:rPr>
               <w:t>Result</w:t>
             </w:r>
@@ -507,13 +642,14 @@
       <w:tr>
         <w:tc>
           <w:tcPr>
-            <w:tcW w:type="dxa" w:w="2340"/>
+            <w:tcW w:type="dxa" w:w="2484"/>
             <w:shd w:val="clear" w:color="auto" w:fill="F8FAFC"/>
           </w:tcPr>
           <w:p>
             <w:r>
               <w:rPr>
-                <w:rFonts w:ascii="Calibri" w:hAnsi="Calibri"/>
+                <w:rFonts w:ascii="Arial" w:hAnsi="Arial"/>
+                <w:sz w:val="18"/>
               </w:rPr>
               <w:t>v1.0.0</w:t>
             </w:r>
@@ -521,13 +657,14 @@
         </w:tc>
         <w:tc>
           <w:tcPr>
-            <w:tcW w:type="dxa" w:w="2340"/>
+            <w:tcW w:type="dxa" w:w="2484"/>
             <w:shd w:val="clear" w:color="auto" w:fill="F8FAFC"/>
           </w:tcPr>
           <w:p>
             <w:r>
               <w:rPr>
-                <w:rFonts w:ascii="Calibri" w:hAnsi="Calibri"/>
+                <w:rFonts w:ascii="Arial" w:hAnsi="Arial"/>
+                <w:sz w:val="18"/>
               </w:rPr>
               <w:t>Deploy Release</w:t>
             </w:r>
@@ -535,13 +672,14 @@
         </w:tc>
         <w:tc>
           <w:tcPr>
-            <w:tcW w:type="dxa" w:w="2340"/>
+            <w:tcW w:type="dxa" w:w="2484"/>
             <w:shd w:val="clear" w:color="auto" w:fill="F8FAFC"/>
           </w:tcPr>
           <w:p>
             <w:r>
               <w:rPr>
-                <w:rFonts w:ascii="Calibri" w:hAnsi="Calibri"/>
+                <w:rFonts w:ascii="Arial" w:hAnsi="Arial"/>
+                <w:sz w:val="18"/>
               </w:rPr>
               <w:t>Built &amp; Pushed to ECR</w:t>
             </w:r>
@@ -549,13 +687,14 @@
         </w:tc>
         <w:tc>
           <w:tcPr>
-            <w:tcW w:type="dxa" w:w="2340"/>
+            <w:tcW w:type="dxa" w:w="2484"/>
             <w:shd w:val="clear" w:color="auto" w:fill="F8FAFC"/>
           </w:tcPr>
           <w:p>
             <w:r>
               <w:rPr>
-                <w:rFonts w:ascii="Calibri" w:hAnsi="Calibri"/>
+                <w:rFonts w:ascii="Arial" w:hAnsi="Arial"/>
+                <w:sz w:val="18"/>
               </w:rPr>
               <w:t>Success (Replicas 3/3)</w:t>
             </w:r>
@@ -565,13 +704,14 @@
       <w:tr>
         <w:tc>
           <w:tcPr>
-            <w:tcW w:type="dxa" w:w="2340"/>
+            <w:tcW w:type="dxa" w:w="2484"/>
             <w:shd w:val="clear" w:color="auto" w:fill="FFFFFF"/>
           </w:tcPr>
           <w:p>
             <w:r>
               <w:rPr>
-                <w:rFonts w:ascii="Calibri" w:hAnsi="Calibri"/>
+                <w:rFonts w:ascii="Arial" w:hAnsi="Arial"/>
+                <w:sz w:val="18"/>
               </w:rPr>
               <w:t>v1.1.0</w:t>
             </w:r>
@@ -579,13 +719,14 @@
         </w:tc>
         <w:tc>
           <w:tcPr>
-            <w:tcW w:type="dxa" w:w="2340"/>
+            <w:tcW w:type="dxa" w:w="2484"/>
             <w:shd w:val="clear" w:color="auto" w:fill="FFFFFF"/>
           </w:tcPr>
           <w:p>
             <w:r>
               <w:rPr>
-                <w:rFonts w:ascii="Calibri" w:hAnsi="Calibri"/>
+                <w:rFonts w:ascii="Arial" w:hAnsi="Arial"/>
+                <w:sz w:val="18"/>
               </w:rPr>
               <w:t>Deploy Release</w:t>
             </w:r>
@@ -593,13 +734,14 @@
         </w:tc>
         <w:tc>
           <w:tcPr>
-            <w:tcW w:type="dxa" w:w="2340"/>
+            <w:tcW w:type="dxa" w:w="2484"/>
             <w:shd w:val="clear" w:color="auto" w:fill="FFFFFF"/>
           </w:tcPr>
           <w:p>
             <w:r>
               <w:rPr>
-                <w:rFonts w:ascii="Calibri" w:hAnsi="Calibri"/>
+                <w:rFonts w:ascii="Arial" w:hAnsi="Arial"/>
+                <w:sz w:val="18"/>
               </w:rPr>
               <w:t>Built &amp; Pushed to ECR</w:t>
             </w:r>
@@ -607,13 +749,14 @@
         </w:tc>
         <w:tc>
           <w:tcPr>
-            <w:tcW w:type="dxa" w:w="2340"/>
+            <w:tcW w:type="dxa" w:w="2484"/>
             <w:shd w:val="clear" w:color="auto" w:fill="FFFFFF"/>
           </w:tcPr>
           <w:p>
             <w:r>
               <w:rPr>
-                <w:rFonts w:ascii="Calibri" w:hAnsi="Calibri"/>
+                <w:rFonts w:ascii="Arial" w:hAnsi="Arial"/>
+                <w:sz w:val="18"/>
               </w:rPr>
               <w:t>Success (Rolling Update)</w:t>
             </w:r>
@@ -623,13 +766,14 @@
       <w:tr>
         <w:tc>
           <w:tcPr>
-            <w:tcW w:type="dxa" w:w="2340"/>
+            <w:tcW w:type="dxa" w:w="2484"/>
             <w:shd w:val="clear" w:color="auto" w:fill="F8FAFC"/>
           </w:tcPr>
           <w:p>
             <w:r>
               <w:rPr>
-                <w:rFonts w:ascii="Calibri" w:hAnsi="Calibri"/>
+                <w:rFonts w:ascii="Arial" w:hAnsi="Arial"/>
+                <w:sz w:val="18"/>
               </w:rPr>
               <w:t>v1.2.0</w:t>
             </w:r>
@@ -637,13 +781,14 @@
         </w:tc>
         <w:tc>
           <w:tcPr>
-            <w:tcW w:type="dxa" w:w="2340"/>
+            <w:tcW w:type="dxa" w:w="2484"/>
             <w:shd w:val="clear" w:color="auto" w:fill="F8FAFC"/>
           </w:tcPr>
           <w:p>
             <w:r>
               <w:rPr>
-                <w:rFonts w:ascii="Calibri" w:hAnsi="Calibri"/>
+                <w:rFonts w:ascii="Arial" w:hAnsi="Arial"/>
+                <w:sz w:val="18"/>
               </w:rPr>
               <w:t>Deploy Release</w:t>
             </w:r>
@@ -651,13 +796,14 @@
         </w:tc>
         <w:tc>
           <w:tcPr>
-            <w:tcW w:type="dxa" w:w="2340"/>
+            <w:tcW w:type="dxa" w:w="2484"/>
             <w:shd w:val="clear" w:color="auto" w:fill="F8FAFC"/>
           </w:tcPr>
           <w:p>
             <w:r>
               <w:rPr>
-                <w:rFonts w:ascii="Calibri" w:hAnsi="Calibri"/>
+                <w:rFonts w:ascii="Arial" w:hAnsi="Arial"/>
+                <w:sz w:val="18"/>
               </w:rPr>
               <w:t>Built &amp; Pushed to ECR</w:t>
             </w:r>
@@ -665,13 +811,14 @@
         </w:tc>
         <w:tc>
           <w:tcPr>
-            <w:tcW w:type="dxa" w:w="2340"/>
+            <w:tcW w:type="dxa" w:w="2484"/>
             <w:shd w:val="clear" w:color="auto" w:fill="F8FAFC"/>
           </w:tcPr>
           <w:p>
             <w:r>
               <w:rPr>
-                <w:rFonts w:ascii="Calibri" w:hAnsi="Calibri"/>
+                <w:rFonts w:ascii="Arial" w:hAnsi="Arial"/>
+                <w:sz w:val="18"/>
               </w:rPr>
               <w:t>Success (Rolling Update)</w:t>
             </w:r>
@@ -681,13 +828,14 @@
       <w:tr>
         <w:tc>
           <w:tcPr>
-            <w:tcW w:type="dxa" w:w="2340"/>
+            <w:tcW w:type="dxa" w:w="2484"/>
             <w:shd w:val="clear" w:color="auto" w:fill="FFFFFF"/>
           </w:tcPr>
           <w:p>
             <w:r>
               <w:rPr>
-                <w:rFonts w:ascii="Calibri" w:hAnsi="Calibri"/>
+                <w:rFonts w:ascii="Arial" w:hAnsi="Arial"/>
+                <w:sz w:val="18"/>
               </w:rPr>
               <w:t>v1.0.0</w:t>
             </w:r>
@@ -695,13 +843,14 @@
         </w:tc>
         <w:tc>
           <w:tcPr>
-            <w:tcW w:type="dxa" w:w="2340"/>
+            <w:tcW w:type="dxa" w:w="2484"/>
             <w:shd w:val="clear" w:color="auto" w:fill="FFFFFF"/>
           </w:tcPr>
           <w:p>
             <w:r>
               <w:rPr>
-                <w:rFonts w:ascii="Calibri" w:hAnsi="Calibri"/>
+                <w:rFonts w:ascii="Arial" w:hAnsi="Arial"/>
+                <w:sz w:val="18"/>
               </w:rPr>
               <w:t>Rollback</w:t>
             </w:r>
@@ -709,13 +858,14 @@
         </w:tc>
         <w:tc>
           <w:tcPr>
-            <w:tcW w:type="dxa" w:w="2340"/>
+            <w:tcW w:type="dxa" w:w="2484"/>
             <w:shd w:val="clear" w:color="auto" w:fill="FFFFFF"/>
           </w:tcPr>
           <w:p>
             <w:r>
               <w:rPr>
-                <w:rFonts w:ascii="Calibri" w:hAnsi="Calibri"/>
+                <w:rFonts w:ascii="Arial" w:hAnsi="Arial"/>
+                <w:sz w:val="18"/>
               </w:rPr>
               <w:t>Direct from ECR (No Rebuild)</w:t>
             </w:r>
@@ -723,15 +873,16 @@
         </w:tc>
         <w:tc>
           <w:tcPr>
-            <w:tcW w:type="dxa" w:w="2340"/>
+            <w:tcW w:type="dxa" w:w="2484"/>
             <w:shd w:val="clear" w:color="auto" w:fill="FFFFFF"/>
           </w:tcPr>
           <w:p>
             <w:r>
               <w:rPr>
-                <w:rFonts w:ascii="Calibri" w:hAnsi="Calibri"/>
+                <w:rFonts w:ascii="Arial" w:hAnsi="Arial"/>
+                <w:sz w:val="18"/>
               </w:rPr>
-              <w:t>Rollback Verified</w:t>
+              <w:t>Rollback Verified Success</w:t>
             </w:r>
           </w:p>
         </w:tc>
@@ -743,9 +894,9 @@
           <w:rFonts w:ascii="Khmer OS Battambang" w:hAnsi="Khmer OS Battambang"/>
           <w:b/>
           <w:color w:val="1E3A8A"/>
-          <w:sz w:val="26"/>
+          <w:sz w:val="24"/>
         </w:rPr>
-        <w:t>៧. បញ្ហាប្រឈម និងដំណោះស្រាយ (Challenges &amp; Solutions)</w:t>
+        <w:t>៦. សេចក្តីសន្និដ្ឋាន (Conclusion)</w:t>
       </w:r>
     </w:p>
     <w:p>
@@ -755,34 +906,7 @@
       <w:r>
         <w:rPr>
           <w:rFonts w:ascii="Khmer OS Battambang" w:hAnsi="Khmer OS Battambang"/>
-          <w:sz w:val="21"/>
-        </w:rPr>
-        <w:t>• បញ្ហា Webhook ចាប់យក Push ធម្មតា៖ បានកំណត់ Branch Specifier ក្នុង Jenkins ទៅជា '*/tags/*' ដើម្បីឱ្យ Jenkins ចាប់តែ Tag Push។</w:t>
-        <w:br/>
-        <w:t>• បញ្ហា Worker Nodes មិនអាច Pull Private Image ពេល Rollback៖ បានបន្ថែមការផ្ញើ ECR Token ថ្មីទៅកាន់ Swarm Manager រាល់ពេល Rollback។</w:t>
-        <w:br/>
-        <w:t>• ជៀសវាងការ Rebuild កំឡុងពេល Rollback៖ បានបង្កើត Stage ដាច់ដោយឡែកសម្រាប់ Rollback ដែលរំលង Stage Checkout &amp; Build ទាំងស្រុង។</w:t>
-      </w:r>
-    </w:p>
-    <w:p>
-      <w:r>
-        <w:rPr>
-          <w:rFonts w:ascii="Khmer OS Battambang" w:hAnsi="Khmer OS Battambang"/>
-          <w:b/>
-          <w:color w:val="1E3A8A"/>
-          <w:sz w:val="26"/>
-        </w:rPr>
-        <w:t>៨. សេចក្តីសន្និដ្ឋាន (Conclusion)</w:t>
-      </w:r>
-    </w:p>
-    <w:p>
-      <w:pPr>
-        <w:spacing w:line="276" w:lineRule="auto"/>
-      </w:pPr>
-      <w:r>
-        <w:rPr>
-          <w:rFonts w:ascii="Khmer OS Battambang" w:hAnsi="Khmer OS Battambang"/>
-          <w:sz w:val="21"/>
+          <w:sz w:val="20"/>
         </w:rPr>
         <w:t>កិច្ចការ Homework 3 នេះបានបង្ហាញពីប្រសិទ្ធភាពខ្ពស់នៃ Release Management ក្នុងប្រព័ន្ធ Cloud DevOps។ ការរួមបញ្ចូលគ្នារវាង Semantic Versioning, Immutable Image Tags ក្នុង Amazon ECR, Parameterized Jenkins Pipeline, និង Zero-Downtime Rollback លើ Docker Swarm ផ្តល់នូវស្តង់ដារវិស្វកម្មកម្រិត Production ដ៏រឹងមាំសម្រាប់គ្រប់គ្រងកម្មវិធី។</w:t>
         <w:br/>
@@ -795,7 +919,7 @@
     </w:p>
     <w:sectPr>
       <w:pgSz w:w="12240" w:h="15840"/>
-      <w:pgMar w:top="1440" w:right="1440" w:bottom="1440" w:left="1440" w:header="720" w:footer="720" w:gutter="0"/>
+      <w:pgMar w:top="1152" w:right="1152" w:bottom="1152" w:left="1152" w:header="720" w:footer="720" w:gutter="0"/>
       <w:cols w:space="720"/>
       <w:docGrid w:linePitch="360"/>
     </w:sectPr>

</xml_diff>